<commit_message>
Reskin Wellness Wheel with Kris Pierce Consulting brand
The prototype was inadvertently built with the Rare Intelligence 'Deep
Signal' palette (cool clinical navy/teal). Reskinned to a warm,
restorative wellness identity for Kris Pierce Consulting:

- Light theme: warm cream surfaces, sage-green primary, clay accent
- Earthy per-dimension accents (sage, rose, gold, coral, plum, clay,
  olive, bronze)
- Warm serif headings (Fraunces) + humanist sans body (Inter)
- Soft card shadows for depth on the light background
- Handoff doc design-token section updated to match
</commit_message>
<xml_diff>
--- a/wellness-wheel-handoff.docx
+++ b/wellness-wheel-handoff.docx
@@ -9,7 +9,7 @@
       <w:r>
         <w:rPr>
           <w:b/>
-          <w:color w:val="00C9B1"/>
+          <w:color w:val="4F7C6B"/>
           <w:sz w:val="68"/>
         </w:rPr>
         <w:t>Wellness Wheel</w:t>
@@ -21,7 +21,7 @@
       </w:pPr>
       <w:r>
         <w:rPr>
-          <w:color w:val="080F1E"/>
+          <w:color w:val="34302B"/>
           <w:sz w:val="32"/>
         </w:rPr>
         <w:t>Developer Handoff Brief</w:t>
@@ -33,10 +33,10 @@
       </w:pPr>
       <w:r>
         <w:rPr>
-          <w:color w:val="5A6A78"/>
+          <w:color w:val="8A7D6E"/>
           <w:sz w:val="22"/>
         </w:rPr>
-        <w:t>Kris Pierce · Prototype to Production · Prepared for engineering</w:t>
+        <w:t>Kris Pierce Consulting · Prototype to Production · Prepared for engineering</w:t>
       </w:r>
     </w:p>
     <w:p/>
@@ -59,7 +59,7 @@
       </w:pPr>
       <w:r>
         <w:rPr>
-          <w:color w:val="080F1E"/>
+          <w:color w:val="34302B"/>
         </w:rPr>
         <w:t>1. Product Overview &amp; User Journey</w:t>
       </w:r>
@@ -78,7 +78,7 @@
       </w:pPr>
       <w:r>
         <w:rPr>
-          <w:color w:val="1A4FBF"/>
+          <w:color w:val="C97C5D"/>
         </w:rPr>
         <w:t>The eight dimensions</w:t>
       </w:r>
@@ -153,7 +153,7 @@
       </w:pPr>
       <w:r>
         <w:rPr>
-          <w:color w:val="1A4FBF"/>
+          <w:color w:val="C97C5D"/>
         </w:rPr>
         <w:t>Core user journey</w:t>
       </w:r>
@@ -228,7 +228,7 @@
       </w:pPr>
       <w:r>
         <w:rPr>
-          <w:color w:val="080F1E"/>
+          <w:color w:val="34302B"/>
         </w:rPr>
         <w:t>2. File Structure &amp; Component Architecture</w:t>
       </w:r>
@@ -272,7 +272,7 @@
       </w:pPr>
       <w:r>
         <w:rPr>
-          <w:color w:val="1A4FBF"/>
+          <w:color w:val="C97C5D"/>
         </w:rPr>
         <w:t>Component map</w:t>
       </w:r>
@@ -531,7 +531,7 @@
       </w:pPr>
       <w:r>
         <w:rPr>
-          <w:color w:val="080F1E"/>
+          <w:color w:val="34302B"/>
         </w:rPr>
         <w:t>3. Gamification System</w:t>
       </w:r>
@@ -542,7 +542,7 @@
       </w:pPr>
       <w:r>
         <w:rPr>
-          <w:color w:val="1A4FBF"/>
+          <w:color w:val="C97C5D"/>
         </w:rPr>
         <w:t>Points</w:t>
       </w:r>
@@ -585,7 +585,7 @@
       </w:pPr>
       <w:r>
         <w:rPr>
-          <w:color w:val="1A4FBF"/>
+          <w:color w:val="C97C5D"/>
         </w:rPr>
         <w:t>Levels</w:t>
       </w:r>
@@ -813,7 +813,7 @@
       </w:pPr>
       <w:r>
         <w:rPr>
-          <w:color w:val="1A4FBF"/>
+          <w:color w:val="C97C5D"/>
         </w:rPr>
         <w:t>Streaks</w:t>
       </w:r>
@@ -832,7 +832,7 @@
       </w:pPr>
       <w:r>
         <w:rPr>
-          <w:color w:val="1A4FBF"/>
+          <w:color w:val="C97C5D"/>
         </w:rPr>
         <w:t>Badges (12)</w:t>
       </w:r>
@@ -1157,7 +1157,7 @@
       </w:pPr>
       <w:r>
         <w:rPr>
-          <w:color w:val="080F1E"/>
+          <w:color w:val="34302B"/>
         </w:rPr>
         <w:t>4. Content Inventory</w:t>
       </w:r>
@@ -1231,7 +1231,7 @@
       </w:pPr>
       <w:r>
         <w:rPr>
-          <w:color w:val="080F1E"/>
+          <w:color w:val="34302B"/>
         </w:rPr>
         <w:t>5. Backend Integration Points</w:t>
       </w:r>
@@ -1250,7 +1250,7 @@
       </w:pPr>
       <w:r>
         <w:rPr>
-          <w:color w:val="1A4FBF"/>
+          <w:color w:val="C97C5D"/>
         </w:rPr>
         <w:t>5.1 Authentication</w:t>
       </w:r>
@@ -1277,7 +1277,7 @@
       </w:pPr>
       <w:r>
         <w:rPr>
-          <w:color w:val="1A4FBF"/>
+          <w:color w:val="C97C5D"/>
         </w:rPr>
         <w:t>5.2 Database / persistence</w:t>
       </w:r>
@@ -1478,7 +1478,7 @@
       </w:pPr>
       <w:r>
         <w:rPr>
-          <w:color w:val="1A4FBF"/>
+          <w:color w:val="C97C5D"/>
         </w:rPr>
         <w:t>5.3 Accountability partner email</w:t>
       </w:r>
@@ -1513,7 +1513,7 @@
       </w:pPr>
       <w:r>
         <w:rPr>
-          <w:color w:val="1A4FBF"/>
+          <w:color w:val="C97C5D"/>
         </w:rPr>
         <w:t>5.4 Push notifications &amp; reminders</w:t>
       </w:r>
@@ -1548,7 +1548,7 @@
       </w:pPr>
       <w:r>
         <w:rPr>
-          <w:color w:val="1A4FBF"/>
+          <w:color w:val="C97C5D"/>
         </w:rPr>
         <w:t>5.5 Analytics events</w:t>
       </w:r>
@@ -1567,7 +1567,7 @@
       </w:pPr>
       <w:r>
         <w:rPr>
-          <w:color w:val="1A4FBF"/>
+          <w:color w:val="C97C5D"/>
         </w:rPr>
         <w:t>5.6 Monetisation gate (optional)</w:t>
       </w:r>
@@ -1586,7 +1586,7 @@
       </w:pPr>
       <w:r>
         <w:rPr>
-          <w:color w:val="080F1E"/>
+          <w:color w:val="34302B"/>
         </w:rPr>
         <w:t>6. Local Development Setup</w:t>
       </w:r>
@@ -1597,7 +1597,7 @@
       </w:pPr>
       <w:r>
         <w:rPr>
-          <w:color w:val="1A4FBF"/>
+          <w:color w:val="C97C5D"/>
         </w:rPr>
         <w:t>Option A — Vite (recommended)</w:t>
       </w:r>
@@ -1640,7 +1640,7 @@
       </w:pPr>
       <w:r>
         <w:rPr>
-          <w:color w:val="1A4FBF"/>
+          <w:color w:val="C97C5D"/>
         </w:rPr>
         <w:t>Option B — Create React App</w:t>
       </w:r>
@@ -1667,7 +1667,7 @@
       </w:pPr>
       <w:r>
         <w:rPr>
-          <w:color w:val="1A4FBF"/>
+          <w:color w:val="C97C5D"/>
         </w:rPr>
         <w:t>Option C — claude.ai artifact</w:t>
       </w:r>
@@ -1686,7 +1686,7 @@
       </w:pPr>
       <w:r>
         <w:rPr>
-          <w:color w:val="080F1E"/>
+          <w:color w:val="34302B"/>
         </w:rPr>
         <w:t>7. Recommended Build Roadmap</w:t>
       </w:r>
@@ -1697,7 +1697,7 @@
       </w:pPr>
       <w:r>
         <w:rPr>
-          <w:color w:val="1A4FBF"/>
+          <w:color w:val="C97C5D"/>
         </w:rPr>
         <w:t>Phase 1 — Foundation</w:t>
       </w:r>
@@ -1732,7 +1732,7 @@
       </w:pPr>
       <w:r>
         <w:rPr>
-          <w:color w:val="1A4FBF"/>
+          <w:color w:val="C97C5D"/>
         </w:rPr>
         <w:t>Phase 2 — Engagement</w:t>
       </w:r>
@@ -1767,7 +1767,7 @@
       </w:pPr>
       <w:r>
         <w:rPr>
-          <w:color w:val="1A4FBF"/>
+          <w:color w:val="C97C5D"/>
         </w:rPr>
         <w:t>Phase 3 — Social &amp; growth</w:t>
       </w:r>
@@ -1802,7 +1802,7 @@
       </w:pPr>
       <w:r>
         <w:rPr>
-          <w:color w:val="080F1E"/>
+          <w:color w:val="34302B"/>
         </w:rPr>
         <w:t>8. Known Limitations &amp; Design Decisions</w:t>
       </w:r>
@@ -1861,9 +1861,17 @@
       </w:pPr>
       <w:r>
         <w:rPr>
-          <w:color w:val="080F1E"/>
+          <w:color w:val="34302B"/>
         </w:rPr>
         <w:t>9. Design Tokens &amp; Specs</w:t>
+      </w:r>
+    </w:p>
+    <w:p>
+      <w:r>
+        <w:rPr>
+          <w:b/>
+        </w:rPr>
+        <w:t>Brand: Kris Pierce Consulting — a warm, restorative wellness identity. This is deliberately separate from the Rare Intelligence “Deep Signal” brand (cool clinical navy/teal). The Wellness Wheel uses a light theme: sage-green primary, clay accent, and warm cream surfaces.</w:t>
       </w:r>
     </w:p>
     <w:p>
@@ -1872,7 +1880,7 @@
       </w:pPr>
       <w:r>
         <w:rPr>
-          <w:color w:val="1A4FBF"/>
+          <w:color w:val="C97C5D"/>
         </w:rPr>
         <w:t>Brand colour palette</w:t>
       </w:r>
@@ -1939,7 +1947,7 @@
           </w:tcPr>
           <w:p>
             <w:r>
-              <w:t>Vivid teal</w:t>
+              <w:t>Sage (primary)</w:t>
             </w:r>
           </w:p>
         </w:tc>
@@ -1949,7 +1957,7 @@
           </w:tcPr>
           <w:p>
             <w:r>
-              <w:t>#00C9B1</w:t>
+              <w:t>#4F7C6B</w:t>
             </w:r>
           </w:p>
         </w:tc>
@@ -1959,7 +1967,7 @@
           </w:tcPr>
           <w:p>
             <w:r>
-              <w:t>Primary accent, progress, earned states</w:t>
+              <w:t>Primary accent, progress, earned states, CTAs</w:t>
             </w:r>
           </w:p>
         </w:tc>
@@ -1971,7 +1979,7 @@
           </w:tcPr>
           <w:p>
             <w:r>
-              <w:t>Aqua</w:t>
+              <w:t>Deep sage</w:t>
             </w:r>
           </w:p>
         </w:tc>
@@ -1981,7 +1989,7 @@
           </w:tcPr>
           <w:p>
             <w:r>
-              <w:t>#3DD6C8</w:t>
+              <w:t>#34604F</w:t>
             </w:r>
           </w:p>
         </w:tc>
@@ -1991,7 +1999,7 @@
           </w:tcPr>
           <w:p>
             <w:r>
-              <w:t>Secondary accent</w:t>
+              <w:t>Active-nav text on sage tint</w:t>
             </w:r>
           </w:p>
         </w:tc>
@@ -2003,7 +2011,7 @@
           </w:tcPr>
           <w:p>
             <w:r>
-              <w:t>Seafoam</w:t>
+              <w:t>Clay</w:t>
             </w:r>
           </w:p>
         </w:tc>
@@ -2013,7 +2021,7 @@
           </w:tcPr>
           <w:p>
             <w:r>
-              <w:t>#80EAD8</w:t>
+              <w:t>#C97C5D</w:t>
             </w:r>
           </w:p>
         </w:tc>
@@ -2023,7 +2031,7 @@
           </w:tcPr>
           <w:p>
             <w:r>
-              <w:t>Soft highlights, success text</w:t>
+              <w:t>Gradient partner + occupational dimension, streak</w:t>
             </w:r>
           </w:p>
         </w:tc>
@@ -2035,7 +2043,7 @@
           </w:tcPr>
           <w:p>
             <w:r>
-              <w:t>Pale mint</w:t>
+              <w:t>Warm gold</w:t>
             </w:r>
           </w:p>
         </w:tc>
@@ -2045,7 +2053,7 @@
           </w:tcPr>
           <w:p>
             <w:r>
-              <w:t>#C2F5EE</w:t>
+              <w:t>#C99A3F</w:t>
             </w:r>
           </w:p>
         </w:tc>
@@ -2055,7 +2063,7 @@
           </w:tcPr>
           <w:p>
             <w:r>
-              <w:t>Badge / toast text on dark</w:t>
+              <w:t>Intellectual dimension</w:t>
             </w:r>
           </w:p>
         </w:tc>
@@ -2067,7 +2075,7 @@
           </w:tcPr>
           <w:p>
             <w:r>
-              <w:t>Ghost</w:t>
+              <w:t>Bronze</w:t>
             </w:r>
           </w:p>
         </w:tc>
@@ -2077,7 +2085,7 @@
           </w:tcPr>
           <w:p>
             <w:r>
-              <w:t>#EEF8F7</w:t>
+              <w:t>#A9742F</w:t>
             </w:r>
           </w:p>
         </w:tc>
@@ -2087,7 +2095,7 @@
           </w:tcPr>
           <w:p>
             <w:r>
-              <w:t>Primary text on dark</w:t>
+              <w:t>Financial dimension</w:t>
             </w:r>
           </w:p>
         </w:tc>
@@ -2099,7 +2107,7 @@
           </w:tcPr>
           <w:p>
             <w:r>
-              <w:t>Cobalt</w:t>
+              <w:t>Soft plum</w:t>
             </w:r>
           </w:p>
         </w:tc>
@@ -2109,7 +2117,7 @@
           </w:tcPr>
           <w:p>
             <w:r>
-              <w:t>#1A4FBF</w:t>
+              <w:t>#7E6191</w:t>
             </w:r>
           </w:p>
         </w:tc>
@@ -2119,7 +2127,7 @@
           </w:tcPr>
           <w:p>
             <w:r>
-              <w:t>Gradient partner to teal</w:t>
+              <w:t>Spiritual dimension</w:t>
             </w:r>
           </w:p>
         </w:tc>
@@ -2131,7 +2139,7 @@
           </w:tcPr>
           <w:p>
             <w:r>
-              <w:t>Ocean</w:t>
+              <w:t>Rose</w:t>
             </w:r>
           </w:p>
         </w:tc>
@@ -2141,7 +2149,7 @@
           </w:tcPr>
           <w:p>
             <w:r>
-              <w:t>#0E7FA8</w:t>
+              <w:t>#C76B7A</w:t>
             </w:r>
           </w:p>
         </w:tc>
@@ -2151,7 +2159,7 @@
           </w:tcPr>
           <w:p>
             <w:r>
-              <w:t>Tertiary accent</w:t>
+              <w:t>Emotional dimension, negative delta</w:t>
             </w:r>
           </w:p>
         </w:tc>
@@ -2163,7 +2171,7 @@
           </w:tcPr>
           <w:p>
             <w:r>
-              <w:t>Deep indigo</w:t>
+              <w:t>Warm coral</w:t>
             </w:r>
           </w:p>
         </w:tc>
@@ -2173,7 +2181,7 @@
           </w:tcPr>
           <w:p>
             <w:r>
-              <w:t>#2D3580</w:t>
+              <w:t>#D98C5A</w:t>
             </w:r>
           </w:p>
         </w:tc>
@@ -2183,7 +2191,7 @@
           </w:tcPr>
           <w:p>
             <w:r>
-              <w:t>Depth accent</w:t>
+              <w:t>Social dimension</w:t>
             </w:r>
           </w:p>
         </w:tc>
@@ -2195,7 +2203,7 @@
           </w:tcPr>
           <w:p>
             <w:r>
-              <w:t>Midnight navy</w:t>
+              <w:t>Olive</w:t>
             </w:r>
           </w:p>
         </w:tc>
@@ -2205,7 +2213,7 @@
           </w:tcPr>
           <w:p>
             <w:r>
-              <w:t>#080F1E</w:t>
+              <w:t>#6E8B4A</w:t>
             </w:r>
           </w:p>
         </w:tc>
@@ -2215,7 +2223,7 @@
           </w:tcPr>
           <w:p>
             <w:r>
-              <w:t>Page background</w:t>
+              <w:t>Environmental dimension</w:t>
             </w:r>
           </w:p>
         </w:tc>
@@ -2227,7 +2235,7 @@
           </w:tcPr>
           <w:p>
             <w:r>
-              <w:t>Navy card</w:t>
+              <w:t>Warm cream</w:t>
             </w:r>
           </w:p>
         </w:tc>
@@ -2237,7 +2245,39 @@
           </w:tcPr>
           <w:p>
             <w:r>
-              <w:t>#0E1C35</w:t>
+              <w:t>#FBF6EF</w:t>
+            </w:r>
+          </w:p>
+        </w:tc>
+        <w:tc>
+          <w:tcPr>
+            <w:tcW w:type="dxa" w:w="2880"/>
+          </w:tcPr>
+          <w:p>
+            <w:r>
+              <w:t>Page background AND text on accent fills</w:t>
+            </w:r>
+          </w:p>
+        </w:tc>
+      </w:tr>
+      <w:tr>
+        <w:tc>
+          <w:tcPr>
+            <w:tcW w:type="dxa" w:w="2880"/>
+          </w:tcPr>
+          <w:p>
+            <w:r>
+              <w:t>White</w:t>
+            </w:r>
+          </w:p>
+        </w:tc>
+        <w:tc>
+          <w:tcPr>
+            <w:tcW w:type="dxa" w:w="2880"/>
+          </w:tcPr>
+          <w:p>
+            <w:r>
+              <w:t>#FFFFFF</w:t>
             </w:r>
           </w:p>
         </w:tc>
@@ -2259,7 +2299,7 @@
           </w:tcPr>
           <w:p>
             <w:r>
-              <w:t>Navy lift</w:t>
+              <w:t>Warm sand</w:t>
             </w:r>
           </w:p>
         </w:tc>
@@ -2269,7 +2309,7 @@
           </w:tcPr>
           <w:p>
             <w:r>
-              <w:t>#152844</w:t>
+              <w:t>#F3EADF</w:t>
             </w:r>
           </w:p>
         </w:tc>
@@ -2301,7 +2341,7 @@
           </w:tcPr>
           <w:p>
             <w:r>
-              <w:t>#1D2F4D</w:t>
+              <w:t>#E6DACB</w:t>
             </w:r>
           </w:p>
         </w:tc>
@@ -2323,6 +2363,38 @@
           </w:tcPr>
           <w:p>
             <w:r>
+              <w:t>Warm ink</w:t>
+            </w:r>
+          </w:p>
+        </w:tc>
+        <w:tc>
+          <w:tcPr>
+            <w:tcW w:type="dxa" w:w="2880"/>
+          </w:tcPr>
+          <w:p>
+            <w:r>
+              <w:t>#34302B</w:t>
+            </w:r>
+          </w:p>
+        </w:tc>
+        <w:tc>
+          <w:tcPr>
+            <w:tcW w:type="dxa" w:w="2880"/>
+          </w:tcPr>
+          <w:p>
+            <w:r>
+              <w:t>Primary text</w:t>
+            </w:r>
+          </w:p>
+        </w:tc>
+      </w:tr>
+      <w:tr>
+        <w:tc>
+          <w:tcPr>
+            <w:tcW w:type="dxa" w:w="2880"/>
+          </w:tcPr>
+          <w:p>
+            <w:r>
               <w:t>Warm grey</w:t>
             </w:r>
           </w:p>
@@ -2333,7 +2405,7 @@
           </w:tcPr>
           <w:p>
             <w:r>
-              <w:t>#8BA8A5</w:t>
+              <w:t>#8A7D6E</w:t>
             </w:r>
           </w:p>
         </w:tc>
@@ -2356,7 +2428,7 @@
       </w:pPr>
       <w:r>
         <w:rPr>
-          <w:color w:val="1A4FBF"/>
+          <w:color w:val="C97C5D"/>
         </w:rPr>
         <w:t>Layout &amp; type</w:t>
       </w:r>
@@ -2366,7 +2438,7 @@
         <w:pStyle w:val="ListBullet"/>
       </w:pPr>
       <w:r>
-        <w:t>Max content width 1100px, centred.</w:t>
+        <w:t>Max content width 1100px, centred. Light theme on warm cream (#FBF6EF).</w:t>
       </w:r>
     </w:p>
     <w:p>
@@ -2374,7 +2446,7 @@
         <w:pStyle w:val="ListBullet"/>
       </w:pPr>
       <w:r>
-        <w:t>Cards: 16px radius, 1px hairline border, 20px padding.</w:t>
+        <w:t>Cards: white, 16px radius, 1px hairline border, 20px padding, soft shadow (0 6px 20px rgba(52,48,43,.06)).</w:t>
       </w:r>
     </w:p>
     <w:p>
@@ -2382,7 +2454,7 @@
         <w:pStyle w:val="ListBullet"/>
       </w:pPr>
       <w:r>
-        <w:t>Pills/buttons: 999px radius. Primary = teal→cobalt gradient on navy text.</w:t>
+        <w:t>Pills/buttons: 999px radius. Primary = sage→clay gradient with cream text.</w:t>
       </w:r>
     </w:p>
     <w:p>
@@ -2390,7 +2462,7 @@
         <w:pStyle w:val="ListBullet"/>
       </w:pPr>
       <w:r>
-        <w:t>Font: Inter / system-ui. Headings 800 weight.</w:t>
+        <w:t>Type: warm serif for headings (Fraunces, fallback Iowan Old Style / Georgia); humanist sans for UI/body (Inter / system). Load Fraunces + Inter via Google Fonts in production; the prototype falls back gracefully to system fonts.</w:t>
       </w:r>
     </w:p>
     <w:p>
@@ -2398,7 +2470,7 @@
         <w:pStyle w:val="ListBullet"/>
       </w:pPr>
       <w:r>
-        <w:t>Each dimension has its own accent colour for quick visual scanning.</w:t>
+        <w:t>Each of the 8 dimensions has its own warm, earthy accent colour for quick visual scanning.</w:t>
       </w:r>
     </w:p>
     <w:p>
@@ -2407,7 +2479,7 @@
       </w:pPr>
       <w:r>
         <w:rPr>
-          <w:color w:val="1A4FBF"/>
+          <w:color w:val="C97C5D"/>
         </w:rPr>
         <w:t>Accessibility notes</w:t>
       </w:r>
@@ -2452,7 +2524,7 @@
       <w:r>
         <w:rPr>
           <w:i/>
-          <w:color w:val="5A6A78"/>
+          <w:color w:val="8A7D6E"/>
         </w:rPr>
         <w:t>End of brief — Wellness Wheel handoff</w:t>
       </w:r>

</xml_diff>